<commit_message>
Rearma el sistema: base de datos, plantillas por rubro y cola de envío lenta
- Guarda búsquedas, locales, plantillas y cola en SQLite (migra saved_searches.json)
- Scraper: reseñas, rating, horarios, nocturno, tipo de web (FUDO/Instagram/propia), tipo de teléfono
- Corrige separación de ciudades, historial de enviados y falsos "Enviado"
- Plantillas por rubro con variantes, vista previa y envío manual con link de WhatsApp
- Cola de envío con límite diario, horario, demoras al azar y pausas largas
- Lanzador de un clic que instala dependencias la primera vez

Co-Authored-By: Claude Opus 5.5 <noreply@anthropic.com>
</commit_message>
<xml_diff>
--- a/Mensajes a Usuarios.docx
+++ b/Mensajes a Usuarios.docx
@@ -3,19 +3,17 @@
 <w:document xmlns:wpc="http://schemas.microsoft.com/office/word/2010/wordprocessingCanvas" xmlns:cx="http://schemas.microsoft.com/office/drawing/2014/chartex" xmlns:cx1="http://schemas.microsoft.com/office/drawing/2015/9/8/chartex" xmlns:cx2="http://schemas.microsoft.com/office/drawing/2015/10/21/chartex" xmlns:cx3="http://schemas.microsoft.com/office/drawing/2016/5/9/chartex" xmlns:cx4="http://schemas.microsoft.com/office/drawing/2016/5/10/chartex" xmlns:cx5="http://schemas.microsoft.com/office/drawing/2016/5/11/chartex" xmlns:cx6="http://schemas.microsoft.com/office/drawing/2016/5/12/chartex" xmlns:cx7="http://schemas.microsoft.com/office/drawing/2016/5/13/chartex" xmlns:cx8="http://schemas.microsoft.com/office/drawing/2016/5/14/chartex" xmlns:mc="http://schemas.openxmlformats.org/markup-compatibility/2006" xmlns:aink="http://schemas.microsoft.com/office/drawing/2016/ink" xmlns:am3d="http://schemas.microsoft.com/office/drawing/2017/model3d" xmlns:o="urn:schemas-microsoft-com:office:office" xmlns:oel="http://schemas.microsoft.com/office/2019/extlst" xmlns:r="http://schemas.openxmlformats.org/officeDocument/2006/relationships" xmlns:m="http://schemas.openxmlformats.org/officeDocument/2006/math" xmlns:v="urn:schemas-microsoft-com:vml" xmlns:wp14="http://schemas.microsoft.com/office/word/2010/wordprocessingDrawing" xmlns:wp="http://schemas.openxmlformats.org/drawingml/2006/wordprocessingDrawing" xmlns:w10="urn:schemas-microsoft-com:office:word" xmlns:w="http://schemas.openxmlformats.org/wordprocessingml/2006/main" xmlns:w14="http://schemas.microsoft.com/office/word/2010/wordml" xmlns:w15="http://schemas.microsoft.com/office/word/2012/wordml" xmlns:w16cex="http://schemas.microsoft.com/office/word/2018/wordml/cex" xmlns:w16cid="http://schemas.microsoft.com/office/word/2016/wordml/cid" xmlns:w16="http://schemas.microsoft.com/office/word/2018/wordml" xmlns:w16du="http://schemas.microsoft.com/office/word/2023/wordml/word16du" xmlns:w16sdtdh="http://schemas.microsoft.com/office/word/2020/wordml/sdtdatahash" xmlns:w16sdtfl="http://schemas.microsoft.com/office/word/2024/wordml/sdtformatlock" xmlns:w16se="http://schemas.microsoft.com/office/word/2015/wordml/symex" xmlns:wpg="http://schemas.microsoft.com/office/word/2010/wordprocessingGroup" xmlns:wpi="http://schemas.microsoft.com/office/word/2010/wordprocessingInk" xmlns:wne="http://schemas.microsoft.com/office/word/2006/wordml" xmlns:wps="http://schemas.microsoft.com/office/word/2010/wordprocessingShape" mc:Ignorable="w14 w15 w16se w16cid w16 w16cex w16sdtdh w16sdtfl w16du wp14">
   <w:body>
     <w:p>
-      <w:proofErr w:type="gramStart"/>
-      <w:r>
-        <w:t>Hola!</w:t>
-      </w:r>
-      <w:proofErr w:type="gramEnd"/>
-      <w:r>
-        <w:t xml:space="preserve"> Soy Luciano </w:t>
-      </w:r>
-      <w:r>
-        <w:rPr>
-          <w:rFonts w:ascii="Segoe UI Emoji" w:hAnsi="Segoe UI Emoji" w:cs="Segoe UI Emoji"/>
-        </w:rPr>
-        <w:t>😊</w:t>
+      <w:r>
+        <w:t>Hola</w:t>
+      </w:r>
+      <w:r>
+        <w:t xml:space="preserve"> </w:t>
+      </w:r>
+      <w:r>
+        <w:t>{nombre}</w:t>
+      </w:r>
+      <w:r>
+        <w:t xml:space="preserve"> Soy Luciano</w:t>
       </w:r>
       <w:r>
         <w:br/>
@@ -31,22 +29,27 @@
       <w:r>
         <w:t>Si les interesa, les puedo mostrar un ejemplo de página sin compromiso para que vean cómo quedaría para su gimnasio.</w:t>
       </w:r>
-    </w:p>
-    <w:p/>
-    <w:p>
-      <w:proofErr w:type="gramStart"/>
-      <w:r>
-        <w:t>Hola!</w:t>
-      </w:r>
-      <w:proofErr w:type="gramEnd"/>
       <w:r>
         <w:t xml:space="preserve"> </w:t>
       </w:r>
-      <w:proofErr w:type="gramStart"/>
-      <w:r>
-        <w:t>Cómo están?</w:t>
-      </w:r>
-      <w:proofErr w:type="gramEnd"/>
+      <w:r>
+        <w:t>|||</w:t>
+      </w:r>
+      <w:r>
+        <w:t xml:space="preserve"> </w:t>
+      </w:r>
+      <w:r>
+        <w:t>Hola</w:t>
+      </w:r>
+      <w:r>
+        <w:t xml:space="preserve"> </w:t>
+      </w:r>
+      <w:r>
+        <w:t>{nombre}</w:t>
+      </w:r>
+      <w:r>
+        <w:t xml:space="preserve"> Cómo están?</w:t>
+      </w:r>
       <w:r>
         <w:br/>
         <w:t>Soy Luciano, trabajo haciendo páginas web y justo estoy armando soluciones para gimnasios.</w:t>
@@ -54,39 +57,64 @@
     </w:p>
     <w:p>
       <w:r>
-        <w:t>Vi su negocio y pensé que quizás les podría interesar tener una web propia para mostrar productos, planes, recibir consultas o vender online.</w:t>
+        <w:t>Vi su negocio y pensé que quizás les podría interesar tener una web propia para mostrar productos, planes, recibir consultas o vender online</w:t>
+      </w:r>
+      <w:r>
+        <w:t xml:space="preserve"> suplementos e indumentaria</w:t>
+      </w:r>
+      <w:r>
+        <w:t>.</w:t>
       </w:r>
     </w:p>
     <w:p>
       <w:r>
-        <w:t xml:space="preserve">Si quieren, les puedo mostrar un ejemplo sin compromiso </w:t>
-      </w:r>
-      <w:r>
-        <w:rPr>
-          <w:rFonts w:ascii="Segoe UI Emoji" w:hAnsi="Segoe UI Emoji" w:cs="Segoe UI Emoji"/>
-        </w:rPr>
-        <w:t>😊</w:t>
-      </w:r>
-    </w:p>
-    <w:p/>
-    <w:p>
-      <w:proofErr w:type="gramStart"/>
-      <w:r>
-        <w:t>Hola!</w:t>
-      </w:r>
-      <w:proofErr w:type="gramEnd"/>
-      <w:r>
-        <w:t xml:space="preserve"> Soy Luciano, desarrollo páginas web y estoy trabajando con gimnasios de la zona.</w:t>
+        <w:t>Si quieren, les puedo mostrar un ejemplo sin compromiso</w:t>
+      </w:r>
+      <w:r>
+        <w:t>.</w:t>
+      </w:r>
+      <w:r>
+        <w:t xml:space="preserve"> </w:t>
+      </w:r>
+      <w:r>
+        <w:t>||| </w:t>
+      </w:r>
+      <w:r>
+        <w:t>Hola</w:t>
+      </w:r>
+      <w:r>
+        <w:t xml:space="preserve"> </w:t>
+      </w:r>
+      <w:r>
+        <w:t>{nombre}</w:t>
+      </w:r>
+      <w:r>
+        <w:t xml:space="preserve"> </w:t>
+      </w:r>
+      <w:r>
+        <w:t>s</w:t>
+      </w:r>
+      <w:r>
+        <w:t>oy Luciano, desarrollo páginas web y estoy trabajando con gimnasios de la zona.</w:t>
       </w:r>
     </w:p>
     <w:p>
       <w:r>
-        <w:t>Vi que no tienen web propia y quería contarles lo que puedo armar: catálogo de planes con filtros, carrito de compras, registro de socios, alertas automáticas de vencimiento de cuotas y sección de rutinas. Todo en un solo lugar.</w:t>
+        <w:t>Vi que no tienen web propia y quería contarles lo que puedo armar: catálogo de planes con filtros, carrito de compras</w:t>
+      </w:r>
+      <w:r>
+        <w:t xml:space="preserve"> para suplementos e indumentaria deportiva</w:t>
+      </w:r>
+      <w:r>
+        <w:t>, registro de socios, alertas automáticas de vencimiento de cuotas y sección de rutinas. Todo en un solo lugar.</w:t>
       </w:r>
     </w:p>
     <w:p>
       <w:r>
-        <w:t>Nada invasivo, solo me gustaría mostrarles un modelo armado para que vean cómo quedaría. Sin compromiso. ¿Les parece si coordinamos 10 minutos?</w:t>
+        <w:t>Nada invasivo, solo me gustaría mostrarles un modelo armado para que vean cómo quedaría. Sin compromiso</w:t>
+      </w:r>
+      <w:r>
+        <w:t>.</w:t>
       </w:r>
     </w:p>
     <w:p/>
@@ -147,7 +175,11 @@
         <w:t xml:space="preserve">. </w:t>
       </w:r>
       <w:r>
-        <w:t xml:space="preserve">Estoy ofreciendo creación de paginas web para gimnasios. Por si les interesa dar un paso más y digitalizarse teniendo su espacio en línea. Podes tener un catalogo con filtros, un carrito de compras, registro de usuarios, alertas de pago de cuotas y ofrecer planes de ejercicios en la misma página. Una forma de conectarse y atraer mas clientes. </w:t>
+        <w:t xml:space="preserve">Estoy ofreciendo creación de paginas web para gimnasios. Por si les interesa dar un paso más y digitalizarse teniendo su espacio en línea. Podes tener </w:t>
+      </w:r>
+      <w:r>
+        <w:lastRenderedPageBreak/>
+        <w:t xml:space="preserve">un catalogo con filtros, un carrito de compras, registro de usuarios, alertas de pago de cuotas y ofrecer planes de ejercicios en la misma página. Una forma de conectarse y atraer mas clientes. </w:t>
       </w:r>
     </w:p>
     <w:p>

</xml_diff>